<commit_message>
docs: resolve remaining RDHO method ambiguities
</commit_message>
<xml_diff>
--- a/paper_artifacts/submission_readiness_manuscript_20260724/RDHO_capacity_feasible_controlled_evaluation_clean.docx
+++ b/paper_artifacts/submission_readiness_manuscript_20260724/RDHO_capacity_feasible_controlled_evaluation_clean.docx
@@ -78,7 +78,7 @@
         <w:rPr>
           <w:rFonts w:ascii="Times New Roman" w:hAnsi="Times New Roman" w:eastAsia="Times New Roman" w:cs="Times New Roman"/>
         </w:rPr>
-        <w:t>Mobile edge computing (MEC) complements resource-limited devices with nearby edge and remote cloud resources, but heterogeneous tasks couple discrete execution-node choice with allocated CPU-cycle-rate decisions. This paper develops an RDHO-based capacity-feasible framework: legal-node encoding and allocated CPU-cycle-rate decoding are coupled with deterministic capacity repair, RDHO population search, fixed-objective incumbent tracking and optional coordinate refinement. Under configured end-to-end procedures, RDHO-full achieves the lowest mean reporting fitness. Strict controls with common initialisation, decoder/repair path, exact NFE and common refinement show DBO clearly outperforms RDHO in Experiment A, whereas DBO retains a smaller but statistically significant advantage in Experiment B. The evidence supports the integrated RDHO framework rather than universal superiority of its hybrid population update.</w:t>
+        <w:t>Mobile edge computing (MEC) complements resource-limited devices with nearby edge and remote cloud resources, but heterogeneous tasks couple discrete execution-node choice with allocated CPU-cycle-rate decisions. This paper develops an RDHO-based capacity-feasible framework: legal-node encoding and allocated CPU-cycle-rate decoding are coupled with deterministic capacity repair, RDHO population search, fixed-objective incumbent tracking and optional coordinate refinement. Under configured end-to-end procedures, RDHO-full achieves the lowest mean reporting fitness. Strict controls with common initialisation, decoder/repair path, exact NFE and common refinement show DBO clearly outperforms RDHO in Experiment A; at the prespecified reporting coefficient lambda_ref=1, DBO retains a smaller but statistically significant advantage in Experiment B. The smaller Experiment-B difference is sensitive to the fixed reporting-penalty coefficient. The evidence supports the integrated RDHO framework rather than universal superiority of its hybrid population update.</w:t>
       </w:r>
       <w:r/>
       <w:r/>
@@ -1371,7 +1371,7 @@
         <w:rPr>
           <w:rFonts w:ascii="Times New Roman" w:hAnsi="Times New Roman" w:eastAsia="Times New Roman" w:cs="Times New Roman"/>
         </w:rPr>
-        <w:t>Among feasible alternatives, Algorithm 2 selects the node with largest post-move residual minimum-rate slack, breaking ties by the smallest global node ID. It recomputes use after the move in the next pass. At most N times the number of nodes passes are allowed; if no move resolves an overload, decoding raises an explicit no-feasible-minimum-frequency-assignment error and no fitness is returned. Targets are already minimum-rate feasible, preventing an overload cycle.</w:t>
+        <w:t>Among feasible alternatives, Algorithm 2 selects the node with largest post-move residual minimum-rate slack, breaking ties by the smallest global node ID. It recomputes use after the move in the next pass. At most N times the number of nodes passes are allowed. If this deterministic order cannot construct a feasible minimum-rate reassignment for the decoded candidate, evaluation raises ValueError; this does not prove that the entire scenario has no feasible assignment under another move sequence. The exception propagates and aborts the affected optimiser run: the implementation does not assign +infinity, retain the parent, or resample. The controlled evaluator records the repair failure before re-raising; all reported controlled runs have repair_failure_count=0. Targets are already minimum-rate feasible, preventing an overload cycle within a completed repair.</w:t>
       </w:r>
     </w:p>
     <w:p>
@@ -1982,6 +1982,409 @@
         <w:t>(3)</w:t>
       </w:r>
     </w:p>
+    <w:p>
+      <w:pPr>
+        <w:pStyle w:val="a0"/>
+        <w:keepNext/>
+        <w:spacing w:before="120" w:after="60" w:line="252" w:lineRule="auto"/>
+        <w:jc w:val="center"/>
+      </w:pPr>
+      <w:r>
+        <w:rPr>
+          <w:rFonts w:ascii="Times New Roman" w:hAnsi="Times New Roman" w:eastAsia="Times New Roman" w:cs="Times New Roman"/>
+        </w:rPr>
+        <w:t>Algorithm 2. Deterministic legal-node reassignment and excess-capacity projection shared by all solvers.</w:t>
+      </w:r>
+    </w:p>
+    <w:tbl>
+      <w:tblPr>
+        <w:tblW w:w="8795" w:type="dxa"/>
+        <w:jc w:val="center"/>
+        <w:tblBorders>
+          <w:top w:val="single" w:sz="10" w:space="0" w:color="000000"/>
+          <w:left w:val="none" w:sz="4" w:space="0" w:color="808080"/>
+          <w:bottom w:val="single" w:sz="10" w:space="0" w:color="000000"/>
+          <w:right w:val="none" w:sz="4" w:space="0" w:color="808080"/>
+          <w:insideH w:val="none" w:sz="4" w:space="0" w:color="808080"/>
+          <w:insideV w:val="none" w:sz="4" w:space="0" w:color="808080"/>
+        </w:tblBorders>
+        <w:tblLayout w:type="fixed"/>
+        <w:tblLook w:val="04A0" w:firstRow="1" w:lastRow="0" w:firstColumn="1" w:lastColumn="0" w:noHBand="0" w:noVBand="1"/>
+      </w:tblPr>
+      <w:tblGrid>
+        <w:gridCol w:w="9100"/>
+      </w:tblGrid>
+      <w:tr>
+        <w:trPr>
+          <w:cantSplit/>
+          <w:tblHeader/>
+          <w:jc w:val="center"/>
+        </w:trPr>
+        <w:tc>
+          <w:tcPr>
+            <w:tcW w:w="9100" w:type="dxa"/>
+            <w:tcBorders>
+              <w:top w:val="single" w:sz="8" w:space="0" w:color="000000"/>
+              <w:left w:val="nil"/>
+              <w:bottom w:val="single" w:sz="8" w:space="0" w:color="000000"/>
+              <w:right w:val="nil"/>
+            </w:tcBorders>
+            <w:tcMar>
+              <w:top w:w="60" w:type="dxa"/>
+              <w:left w:w="90" w:type="dxa"/>
+              <w:bottom w:w="60" w:type="dxa"/>
+              <w:right w:w="90" w:type="dxa"/>
+            </w:tcMar>
+            <w:vAlign w:val="center"/>
+            <w:gridSpan w:val="6"/>
+          </w:tcPr>
+          <w:p>
+            <w:pPr>
+              <w:spacing w:after="0"/>
+              <w:jc w:val="center"/>
+              <w:rPr>
+                <w:sz w:val="21"/>
+                <w:szCs w:val="21"/>
+              </w:rPr>
+            </w:pPr>
+            <w:r>
+              <w:rPr>
+                <w:rFonts w:ascii="Times New Roman" w:hAnsi="Times New Roman" w:eastAsia="Times New Roman" w:cs="Times New Roman"/>
+              </w:rPr>
+              <w:t>Algorithm 2. Deterministic Legal-Node Reassignment and Capacity Projection</w:t>
+            </w:r>
+          </w:p>
+        </w:tc>
+      </w:tr>
+      <w:tr>
+        <w:trPr>
+          <w:cantSplit/>
+          <w:jc w:val="center"/>
+        </w:trPr>
+        <w:tc>
+          <w:tcPr>
+            <w:tcW w:w="9100" w:type="dxa"/>
+            <w:tcBorders>
+              <w:top w:val="nil"/>
+              <w:left w:val="nil"/>
+              <w:bottom w:val="nil"/>
+              <w:right w:val="nil"/>
+            </w:tcBorders>
+            <w:tcMar>
+              <w:top w:w="60" w:type="dxa"/>
+              <w:left w:w="90" w:type="dxa"/>
+              <w:bottom w:w="60" w:type="dxa"/>
+              <w:right w:w="90" w:type="dxa"/>
+            </w:tcMar>
+            <w:vAlign w:val="center"/>
+            <w:gridSpan w:val="6"/>
+          </w:tcPr>
+          <w:p>
+            <w:pPr>
+              <w:spacing w:after="0"/>
+              <w:jc w:val="center"/>
+              <w:rPr>
+                <w:sz w:val="21"/>
+                <w:szCs w:val="21"/>
+              </w:rPr>
+            </w:pPr>
+            <w:r>
+              <w:rPr>
+                <w:rFonts w:ascii="Times New Roman" w:hAnsi="Times New Roman" w:eastAsia="Times New Roman" w:cs="Times New Roman"/>
+              </w:rPr>
+              <w:t>Require: decoded legal node IDs and requested allocated CPU-cycle rates; node minima and aggregate capacities.</w:t>
+            </w:r>
+          </w:p>
+        </w:tc>
+      </w:tr>
+      <w:tr>
+        <w:trPr>
+          <w:cantSplit/>
+          <w:jc w:val="center"/>
+        </w:trPr>
+        <w:tc>
+          <w:tcPr>
+            <w:tcW w:w="9100" w:type="dxa"/>
+            <w:tcBorders>
+              <w:top w:val="nil"/>
+              <w:left w:val="nil"/>
+              <w:bottom w:val="nil"/>
+              <w:right w:val="nil"/>
+            </w:tcBorders>
+            <w:tcMar>
+              <w:top w:w="60" w:type="dxa"/>
+              <w:left w:w="90" w:type="dxa"/>
+              <w:bottom w:w="60" w:type="dxa"/>
+              <w:right w:w="90" w:type="dxa"/>
+            </w:tcMar>
+            <w:vAlign w:val="center"/>
+            <w:gridSpan w:val="6"/>
+          </w:tcPr>
+          <w:p>
+            <w:pPr>
+              <w:spacing w:after="0"/>
+              <w:jc w:val="center"/>
+              <w:rPr>
+                <w:sz w:val="21"/>
+                <w:szCs w:val="21"/>
+              </w:rPr>
+            </w:pPr>
+            <w:r>
+              <w:rPr>
+                <w:rFonts w:ascii="Times New Roman" w:hAnsi="Times New Roman" w:eastAsia="Times New Roman" w:cs="Times New Roman"/>
+              </w:rPr>
+              <w:t>1. For at most N times number-of-nodes passes, compute minimum-rate use of each node.</w:t>
+            </w:r>
+          </w:p>
+        </w:tc>
+      </w:tr>
+      <w:tr>
+        <w:trPr>
+          <w:cantSplit/>
+          <w:jc w:val="center"/>
+        </w:trPr>
+        <w:tc>
+          <w:tcPr>
+            <w:tcW w:w="9100" w:type="dxa"/>
+            <w:tcBorders>
+              <w:top w:val="nil"/>
+              <w:left w:val="nil"/>
+              <w:bottom w:val="nil"/>
+              <w:right w:val="nil"/>
+            </w:tcBorders>
+            <w:tcMar>
+              <w:top w:w="60" w:type="dxa"/>
+              <w:left w:w="90" w:type="dxa"/>
+              <w:bottom w:w="60" w:type="dxa"/>
+              <w:right w:w="90" w:type="dxa"/>
+            </w:tcMar>
+            <w:vAlign w:val="center"/>
+            <w:gridSpan w:val="6"/>
+          </w:tcPr>
+          <w:p>
+            <w:pPr>
+              <w:spacing w:after="0"/>
+              <w:jc w:val="center"/>
+              <w:rPr>
+                <w:sz w:val="21"/>
+                <w:szCs w:val="21"/>
+              </w:rPr>
+            </w:pPr>
+            <w:r>
+              <w:rPr>
+                <w:rFonts w:ascii="Times New Roman" w:hAnsi="Times New Roman" w:eastAsia="Times New Roman" w:cs="Times New Roman"/>
+              </w:rPr>
+              <w:t>2. Visit overloaded nodes in ascending global ID; visit their currently assigned task indices in descending order.</w:t>
+            </w:r>
+          </w:p>
+        </w:tc>
+      </w:tr>
+      <w:tr>
+        <w:trPr>
+          <w:cantSplit/>
+          <w:jc w:val="center"/>
+        </w:trPr>
+        <w:tc>
+          <w:tcPr>
+            <w:tcW w:w="9100" w:type="dxa"/>
+            <w:tcBorders>
+              <w:top w:val="nil"/>
+              <w:left w:val="nil"/>
+              <w:bottom w:val="nil"/>
+              <w:right w:val="nil"/>
+            </w:tcBorders>
+            <w:tcMar>
+              <w:top w:w="60" w:type="dxa"/>
+              <w:left w:w="90" w:type="dxa"/>
+              <w:bottom w:w="60" w:type="dxa"/>
+              <w:right w:w="90" w:type="dxa"/>
+            </w:tcMar>
+            <w:vAlign w:val="center"/>
+            <w:gridSpan w:val="6"/>
+          </w:tcPr>
+          <w:p>
+            <w:pPr>
+              <w:spacing w:after="0"/>
+              <w:jc w:val="center"/>
+              <w:rPr>
+                <w:sz w:val="21"/>
+                <w:szCs w:val="21"/>
+              </w:rPr>
+            </w:pPr>
+            <w:r>
+              <w:rPr>
+                <w:rFonts w:ascii="Times New Roman" w:hAnsi="Times New Roman" w:eastAsia="Times New Roman" w:cs="Times New Roman"/>
+              </w:rPr>
+              <w:t>3. For a task, consider legal nodes other than its current node; retain only targets that remain within capacity after receiving that task at the target minimum rate.</w:t>
+            </w:r>
+          </w:p>
+        </w:tc>
+      </w:tr>
+      <w:tr>
+        <w:trPr>
+          <w:cantSplit/>
+          <w:jc w:val="center"/>
+        </w:trPr>
+        <w:tc>
+          <w:tcPr>
+            <w:tcW w:w="9100" w:type="dxa"/>
+            <w:tcBorders>
+              <w:top w:val="nil"/>
+              <w:left w:val="nil"/>
+              <w:bottom w:val="nil" w:sz="8" w:space="0" w:color="000000"/>
+              <w:right w:val="nil"/>
+            </w:tcBorders>
+            <w:tcMar>
+              <w:top w:w="60" w:type="dxa"/>
+              <w:left w:w="90" w:type="dxa"/>
+              <w:bottom w:w="60" w:type="dxa"/>
+              <w:right w:w="90" w:type="dxa"/>
+            </w:tcMar>
+            <w:vAlign w:val="center"/>
+            <w:gridSpan w:val="6"/>
+          </w:tcPr>
+          <w:p>
+            <w:pPr>
+              <w:spacing w:after="0"/>
+              <w:jc w:val="center"/>
+              <w:rPr>
+                <w:sz w:val="21"/>
+                <w:szCs w:val="21"/>
+              </w:rPr>
+            </w:pPr>
+            <w:r>
+              <w:rPr>
+                <w:rFonts w:ascii="Times New Roman" w:hAnsi="Times New Roman" w:eastAsia="Times New Roman" w:cs="Times New Roman"/>
+              </w:rPr>
+              <w:t>4. Move the task to the feasible target with largest post-move residual slack; break ties by smallest global node ID. Recompute use on the next pass.</w:t>
+            </w:r>
+          </w:p>
+        </w:tc>
+      </w:tr>
+      <w:tr>
+        <w:trPr>
+          <w:cantSplit/>
+          <w:jc w:val="center"/>
+        </w:trPr>
+        <w:tc>
+          <w:tcPr>
+            <w:tcW w:w="9100" w:type="dxa"/>
+            <w:tcBorders>
+              <w:top w:val="nil"/>
+              <w:left w:val="nil"/>
+              <w:bottom w:val="nil" w:sz="8" w:space="0" w:color="000000"/>
+              <w:right w:val="nil"/>
+            </w:tcBorders>
+            <w:tcMar>
+              <w:top w:w="60" w:type="dxa"/>
+              <w:left w:w="90" w:type="dxa"/>
+              <w:bottom w:w="60" w:type="dxa"/>
+              <w:right w:w="90" w:type="dxa"/>
+            </w:tcMar>
+            <w:vAlign w:val="center"/>
+            <w:gridSpan w:val="6"/>
+          </w:tcPr>
+          <w:p>
+            <w:pPr>
+              <w:spacing w:after="0"/>
+              <w:jc w:val="center"/>
+              <w:rPr>
+                <w:sz w:val="21"/>
+                <w:szCs w:val="21"/>
+              </w:rPr>
+            </w:pPr>
+            <w:r>
+              <w:rPr>
+                <w:rFonts w:ascii="Times New Roman" w:hAnsi="Times New Roman" w:eastAsia="Times New Roman" w:cs="Times New Roman"/>
+              </w:rPr>
+              <w:t>5. If the deterministic order cannot construct a feasible minimum-rate reassignment for this decoded candidate, raise ValueError and abort the affected optimiser run; do not infer global scenario infeasibility, assign +infinity, retain the parent or resample.</w:t>
+            </w:r>
+          </w:p>
+        </w:tc>
+      </w:tr>
+      <w:tr>
+        <w:trPr>
+          <w:cantSplit/>
+          <w:jc w:val="center"/>
+        </w:trPr>
+        <w:tc>
+          <w:tcPr>
+            <w:tcW w:w="9100" w:type="dxa"/>
+            <w:tcBorders>
+              <w:top w:val="nil"/>
+              <w:left w:val="nil"/>
+              <w:bottom w:val="nil" w:sz="8" w:space="0" w:color="000000"/>
+              <w:right w:val="nil"/>
+            </w:tcBorders>
+            <w:tcMar>
+              <w:top w:w="60" w:type="dxa"/>
+              <w:left w:w="90" w:type="dxa"/>
+              <w:bottom w:w="60" w:type="dxa"/>
+              <w:right w:w="90" w:type="dxa"/>
+            </w:tcMar>
+            <w:vAlign w:val="center"/>
+            <w:gridSpan w:val="6"/>
+          </w:tcPr>
+          <w:p>
+            <w:pPr>
+              <w:spacing w:after="0"/>
+              <w:jc w:val="center"/>
+              <w:rPr>
+                <w:sz w:val="21"/>
+                <w:szCs w:val="21"/>
+              </w:rPr>
+            </w:pPr>
+            <w:r>
+              <w:rPr>
+                <w:rFonts w:ascii="Times New Roman" w:hAnsi="Times New Roman" w:eastAsia="Times New Roman" w:cs="Times New Roman"/>
+              </w:rPr>
+              <w:t>6. When minima fit, set every task to its node minimum. Retain requested excess if total excess fits residual capacity; otherwise proportionally scale only the excess.</w:t>
+            </w:r>
+          </w:p>
+        </w:tc>
+      </w:tr>
+      <w:tr>
+        <w:trPr>
+          <w:cantSplit/>
+          <w:jc w:val="center"/>
+        </w:trPr>
+        <w:tc>
+          <w:tcPr>
+            <w:tcW w:w="9100" w:type="dxa"/>
+            <w:tcBorders>
+              <w:top w:val="nil"/>
+              <w:left w:val="nil"/>
+              <w:bottom w:val="single" w:sz="8" w:space="0" w:color="000000"/>
+              <w:right w:val="nil"/>
+            </w:tcBorders>
+            <w:tcMar>
+              <w:top w:w="60" w:type="dxa"/>
+              <w:left w:w="90" w:type="dxa"/>
+              <w:bottom w:w="60" w:type="dxa"/>
+              <w:right w:w="90" w:type="dxa"/>
+            </w:tcMar>
+            <w:vAlign w:val="center"/>
+            <w:gridSpan w:val="6"/>
+          </w:tcPr>
+          <w:p>
+            <w:pPr>
+              <w:spacing w:after="0"/>
+              <w:jc w:val="center"/>
+              <w:rPr>
+                <w:sz w:val="21"/>
+                <w:szCs w:val="21"/>
+              </w:rPr>
+            </w:pPr>
+            <w:r>
+              <w:rPr>
+                <w:rFonts w:ascii="Times New Roman" w:hAnsi="Times New Roman" w:eastAsia="Times New Roman" w:cs="Times New Roman"/>
+              </w:rPr>
+              <w:t>Ensure: legal unique assignments, allocated rates within selected-node bounds and aggregate capacity; repair targets are pre-feasible, so no overload cycle is introduced.</w:t>
+            </w:r>
+          </w:p>
+        </w:tc>
+      </w:tr>
+    </w:tbl>
     <w:p>
       <w:pPr>
         <w:pStyle w:val="FirstParagraph"/>
@@ -6771,7 +7174,7 @@
         <w:rPr>
           <w:rFonts w:ascii="Times New Roman" w:hAnsi="Times New Roman" w:eastAsia="Times New Roman" w:cs="Times New Roman"/>
         </w:rPr>
-        <w:t>CPU ranges, link rates, powers, overheads, task ranges and utility coefficients are heterogeneous synthetic simulation settings generated from versioned code, not direct hardware calibration. They are applied identically to all algorithms and examined through capacity, SLA and heterogeneity sensitivity analyses. Parameter-source citations supporting any stronger hardware-calibration claim remain an author-confirmation requirement; this paper makes no such claim.</w:t>
+        <w:t>The parameter ranges are synthetic heterogeneous settings designed to generate capacity-constrained MEC instances; they are not claimed as direct hardware calibration. Their orders of magnitude are consistent with representative MEC system and joint resource-allocation studies [1,3,11,13]. The same versioned ranges are applied to every algorithm and are examined through capacity, SLA and heterogeneity sensitivity analyses.</w:t>
       </w:r>
     </w:p>
     <w:p>
@@ -9644,7 +10047,7 @@
         <w:rPr>
           <w:rFonts w:ascii="Times New Roman" w:hAnsi="Times New Roman" w:eastAsia="Times New Roman" w:cs="Times New Roman"/>
         </w:rPr>
-        <w:t>A returned incumbent consists of one repaired legal node and one allocated CPU-cycle rate per task.</w:t>
+        <w:t>Even without continuous allocation, legal node assignments grow combinatorially. Capacity coupling, exponential utility and indicator-based soft violations make P1 a nonlinear mixed discrete-continuous problem.</w:t>
       </w:r>
       <w:r/>
     </w:p>
@@ -9658,7 +10061,7 @@
         <w:rPr>
           <w:rFonts w:ascii="Times New Roman" w:hAnsi="Times New Roman" w:eastAsia="Times New Roman" w:cs="Times New Roman"/>
         </w:rPr>
-        <w:t>These characteristics motivate population search over legal categorical assignments and bounded allocated CPU-cycle-rate decisions; no deployment claim is made.</w:t>
+        <w:t>The study does not claim a new proof of NP-hardness; it motivates a population search and evaluates empirical solution quality and cost.</w:t>
       </w:r>
     </w:p>
     <w:p>
@@ -9885,7 +10288,7 @@
         <w:rPr>
           <w:rFonts w:ascii="Times New Roman" w:hAnsi="Times New Roman" w:eastAsia="Times New Roman" w:cs="Times New Roman"/>
         </w:rPr>
-        <w:t>At iteration t, p=t/T_max and diversity D is the mean over all 2N coordinates of their population standard deviation. Adaptive producer and scout shares are rho_P=clip(0.28-0.10p+0.08D,0.14,0.34) and rho_S=clip(0.08+0.08D+0.04p,0.08,0.20); rho_F=max(0.40,1-rho_P-rho_S). Counts are max(1,floor(P rho_role)). Candidates are ranked by current search fitness; the best max(1,floor(0.10P)) are copied unchanged, then producers occupy the first ranked non-elites, followers the next, scouts the last n_S, and remaining members receive independent N(0,0.04(1-p)) perturbations.</w:t>
+        <w:t>At iteration t, p=t/T_max and diversity D is the mean over all 2N coordinates of their population standard deviation. Adaptive producer and scout shares are rho_P=clip(0.28-0.10p+0.08D,0.14,0.34) and rho_S=clip(0.08+0.08D+0.04p,0.08,0.20); rho_F=max(0.40,1-rho_P-rho_S). Nominal counts n_P, n_F and n_S are max(1,floor(P rho_role)) and are computed from the full P; they are not renormalised to P-n_E after n_E=max(1,floor(0.10P)) elites are reserved. The ranked loop applies deterministic branch precedence: an elite is copied; otherwise rank&lt;n_P gives producer, else rank&lt;n_P+n_F gives follower, else rank&gt;=P-n_S gives scout, else the member receives N(0,0.04(1-p)) noise. Thus elites truncate nominal roles, and if follower/scout thresholds overlap the earlier follower branch takes precedence; no member is assigned twice.</w:t>
       </w:r>
     </w:p>
     <w:p>
@@ -9982,7 +10385,7 @@
         <w:rPr>
           <w:rFonts w:ascii="Times New Roman" w:hAnsi="Times New Roman" w:eastAsia="Times New Roman" w:cs="Times New Roman"/>
         </w:rPr>
-        <w:t>For N tasks, population P, iterations T_max, average legal-node count L and refinement cost R, initialisation is O(PN) plus O(16N) greedy tests, role updates are O(PN), decoding/evaluation is approximately O(PNL), and repair is O(NL) per pass. The practical total is O(PN+T_max PNL+RNL), with O(PN+NL) space for population and decoded legal/capacity state. This implementation-oriented bound is not an optimality guarantee.</w:t>
+        <w:t>For N tasks, M execution nodes, population P, iterations T_max, average legal-node count L and refinement cost R, initialisation is O(PN) plus O(16N) greedy tests, role updates are O(PN), and ordinary decoding/evaluation is approximately O(PNL). A typical repair pass is O(NL); retaining this practical cost gives O(PN+T_max PNL+RNL) time and O(PN+NL) space. In the worst case repair may execute up to NM passes, so one candidate can require O(N^2 M L) repair work and the population-search upper bound includes O(T_max P N^2 M L). This conservative worst case is distinct from the observed zero-failure controlled runs and is not an optimality guarantee.</w:t>
       </w:r>
     </w:p>
     <w:p>
@@ -10680,7 +11083,7 @@
               <w:rPr>
                 <w:rFonts w:ascii="Times New Roman" w:hAnsi="Times New Roman" w:eastAsia="Times New Roman" w:cs="Times New Roman"/>
               </w:rPr>
-              <w:t>Run the shared decoder and Algorithm 2 for every candidate</w:t>
+              <w:t>Run the shared decoder and Algorithm 2 for every candidate; an unrepaired candidate raises ValueError and aborts the run (no +infinity, parent retention or resampling)</w:t>
             </w:r>
           </w:p>
         </w:tc>
@@ -19856,7 +20259,7 @@
         <w:rPr>
           <w:rFonts w:ascii="Times New Roman" w:hAnsi="Times New Roman" w:eastAsia="Times New Roman" w:cs="Times New Roman"/>
         </w:rPr>
-        <w:t>Two strictly controlled paired experiments answer the attribution question directly. Every method receives one identical 50-by-40-by-2 initial population per scenario, follows the common legal-node decoder and Algorithm-2 repair, reports the same fixed reporting fitness and is constrained by an exact total NFE budget. All 90 returns in each experiment are hard feasible. Table 7 reports reporting fitness, base objective B, soft CSR, QoE, fairness, NFE and runtime. The primary endpoint is lower fixed reporting fitness; paired differences DeltaF=F_RDHO-F_parent are negative when RDHO is lower. Experiment A (no refinement, 3,801 NFE) gives DBO a clear advantage: RDHO versus DBO median DeltaF=+0.178910, Holm p=3.725e-09 and W/T/L=0/0/30. Experiment B (common refinement, 10,232 NFE) gives DBO a smaller but statistically significant advantage: means 0.9732 versus 0.9664, difference 0.006801; median DeltaF=+0.008226, Holm p=0.026229 and W/T/L=10/0/20. RDHO remains lower than RIME in both controls.</w:t>
+        <w:t>Two strictly controlled paired experiments answer the attribution question directly. Every method receives one identical 50-by-40-by-2 initial population per scenario, follows the common legal-node decoder and Algorithm-2 repair, reports the same fixed reporting fitness and is constrained by an exact total NFE budget. All 90 returns in each experiment are hard feasible. Table 7 reports reporting fitness, base objective B, soft CSR, QoE, fairness, NFE and runtime. The primary endpoint is lower fixed reporting fitness; paired differences DeltaF=F_RDHO-F_parent are negative when RDHO is lower. Experiment A (no refinement, 3,801 NFE) gives DBO a clear advantage: RDHO versus DBO median DeltaF=+0.178910, Holm p=3.725e-09 and W/T/L=0/0/30. At the prespecified lambda_ref=1, Experiment B (common refinement, 10,232 NFE) gives DBO a smaller but statistically significant advantage: means 0.9732 versus 0.9664, difference 0.006801; median DeltaF=+0.008226, Holm p=0.026229 and W/T/L=10/0/20. RDHO remains lower than RIME in both controls.</w:t>
       </w:r>
     </w:p>
     <w:p>
@@ -23778,409 +24181,6 @@
         <w:t>Weight changes expose engineering preference rather than a universal optimum. Task-utility coefficient sensitivity checks the internal QoE construction, while CPU-capacity, SLA and server-heterogeneity scaling test load, threshold strictness and heterogeneous legal server choices.</w:t>
       </w:r>
     </w:p>
-    <w:p>
-      <w:pPr>
-        <w:pStyle w:val="a0"/>
-        <w:keepNext/>
-        <w:spacing w:before="120" w:after="60" w:line="252" w:lineRule="auto"/>
-        <w:jc w:val="center"/>
-      </w:pPr>
-      <w:r>
-        <w:rPr>
-          <w:rFonts w:ascii="Times New Roman" w:hAnsi="Times New Roman" w:eastAsia="Times New Roman" w:cs="Times New Roman"/>
-        </w:rPr>
-        <w:t>Algorithm 2. Deterministic legal-node reassignment and excess-capacity projection shared by all solvers.</w:t>
-      </w:r>
-    </w:p>
-    <w:tbl>
-      <w:tblPr>
-        <w:tblW w:w="8795" w:type="dxa"/>
-        <w:jc w:val="center"/>
-        <w:tblBorders>
-          <w:top w:val="single" w:sz="10" w:space="0" w:color="000000"/>
-          <w:left w:val="none" w:sz="4" w:space="0" w:color="808080"/>
-          <w:bottom w:val="single" w:sz="10" w:space="0" w:color="000000"/>
-          <w:right w:val="none" w:sz="4" w:space="0" w:color="808080"/>
-          <w:insideH w:val="none" w:sz="4" w:space="0" w:color="808080"/>
-          <w:insideV w:val="none" w:sz="4" w:space="0" w:color="808080"/>
-        </w:tblBorders>
-        <w:tblLayout w:type="fixed"/>
-        <w:tblLook w:val="04A0" w:firstRow="1" w:lastRow="0" w:firstColumn="1" w:lastColumn="0" w:noHBand="0" w:noVBand="1"/>
-      </w:tblPr>
-      <w:tblGrid>
-        <w:gridCol w:w="9100"/>
-      </w:tblGrid>
-      <w:tr>
-        <w:trPr>
-          <w:cantSplit/>
-          <w:tblHeader/>
-          <w:jc w:val="center"/>
-        </w:trPr>
-        <w:tc>
-          <w:tcPr>
-            <w:tcW w:w="9100" w:type="dxa"/>
-            <w:tcBorders>
-              <w:top w:val="single" w:sz="8" w:space="0" w:color="000000"/>
-              <w:left w:val="nil"/>
-              <w:bottom w:val="single" w:sz="8" w:space="0" w:color="000000"/>
-              <w:right w:val="nil"/>
-            </w:tcBorders>
-            <w:tcMar>
-              <w:top w:w="60" w:type="dxa"/>
-              <w:left w:w="90" w:type="dxa"/>
-              <w:bottom w:w="60" w:type="dxa"/>
-              <w:right w:w="90" w:type="dxa"/>
-            </w:tcMar>
-            <w:vAlign w:val="center"/>
-            <w:gridSpan w:val="6"/>
-          </w:tcPr>
-          <w:p>
-            <w:pPr>
-              <w:spacing w:after="0"/>
-              <w:jc w:val="center"/>
-              <w:rPr>
-                <w:sz w:val="21"/>
-                <w:szCs w:val="21"/>
-              </w:rPr>
-            </w:pPr>
-            <w:r>
-              <w:rPr>
-                <w:rFonts w:ascii="Times New Roman" w:hAnsi="Times New Roman" w:eastAsia="Times New Roman" w:cs="Times New Roman"/>
-              </w:rPr>
-              <w:t>Algorithm 2. Deterministic Legal-Node Reassignment and Capacity Projection</w:t>
-            </w:r>
-          </w:p>
-        </w:tc>
-      </w:tr>
-      <w:tr>
-        <w:trPr>
-          <w:cantSplit/>
-          <w:jc w:val="center"/>
-        </w:trPr>
-        <w:tc>
-          <w:tcPr>
-            <w:tcW w:w="9100" w:type="dxa"/>
-            <w:tcBorders>
-              <w:top w:val="nil"/>
-              <w:left w:val="nil"/>
-              <w:bottom w:val="nil"/>
-              <w:right w:val="nil"/>
-            </w:tcBorders>
-            <w:tcMar>
-              <w:top w:w="60" w:type="dxa"/>
-              <w:left w:w="90" w:type="dxa"/>
-              <w:bottom w:w="60" w:type="dxa"/>
-              <w:right w:w="90" w:type="dxa"/>
-            </w:tcMar>
-            <w:vAlign w:val="center"/>
-            <w:gridSpan w:val="6"/>
-          </w:tcPr>
-          <w:p>
-            <w:pPr>
-              <w:spacing w:after="0"/>
-              <w:jc w:val="center"/>
-              <w:rPr>
-                <w:sz w:val="21"/>
-                <w:szCs w:val="21"/>
-              </w:rPr>
-            </w:pPr>
-            <w:r>
-              <w:rPr>
-                <w:rFonts w:ascii="Times New Roman" w:hAnsi="Times New Roman" w:eastAsia="Times New Roman" w:cs="Times New Roman"/>
-              </w:rPr>
-              <w:t>Require: decoded legal node IDs and requested allocated CPU-cycle rates; node minima and aggregate capacities.</w:t>
-            </w:r>
-          </w:p>
-        </w:tc>
-      </w:tr>
-      <w:tr>
-        <w:trPr>
-          <w:cantSplit/>
-          <w:jc w:val="center"/>
-        </w:trPr>
-        <w:tc>
-          <w:tcPr>
-            <w:tcW w:w="9100" w:type="dxa"/>
-            <w:tcBorders>
-              <w:top w:val="nil"/>
-              <w:left w:val="nil"/>
-              <w:bottom w:val="nil"/>
-              <w:right w:val="nil"/>
-            </w:tcBorders>
-            <w:tcMar>
-              <w:top w:w="60" w:type="dxa"/>
-              <w:left w:w="90" w:type="dxa"/>
-              <w:bottom w:w="60" w:type="dxa"/>
-              <w:right w:w="90" w:type="dxa"/>
-            </w:tcMar>
-            <w:vAlign w:val="center"/>
-            <w:gridSpan w:val="6"/>
-          </w:tcPr>
-          <w:p>
-            <w:pPr>
-              <w:spacing w:after="0"/>
-              <w:jc w:val="center"/>
-              <w:rPr>
-                <w:sz w:val="21"/>
-                <w:szCs w:val="21"/>
-              </w:rPr>
-            </w:pPr>
-            <w:r>
-              <w:rPr>
-                <w:rFonts w:ascii="Times New Roman" w:hAnsi="Times New Roman" w:eastAsia="Times New Roman" w:cs="Times New Roman"/>
-              </w:rPr>
-              <w:t>1. For at most N times number-of-nodes passes, compute minimum-rate use of each node.</w:t>
-            </w:r>
-          </w:p>
-        </w:tc>
-      </w:tr>
-      <w:tr>
-        <w:trPr>
-          <w:cantSplit/>
-          <w:jc w:val="center"/>
-        </w:trPr>
-        <w:tc>
-          <w:tcPr>
-            <w:tcW w:w="9100" w:type="dxa"/>
-            <w:tcBorders>
-              <w:top w:val="nil"/>
-              <w:left w:val="nil"/>
-              <w:bottom w:val="nil"/>
-              <w:right w:val="nil"/>
-            </w:tcBorders>
-            <w:tcMar>
-              <w:top w:w="60" w:type="dxa"/>
-              <w:left w:w="90" w:type="dxa"/>
-              <w:bottom w:w="60" w:type="dxa"/>
-              <w:right w:w="90" w:type="dxa"/>
-            </w:tcMar>
-            <w:vAlign w:val="center"/>
-            <w:gridSpan w:val="6"/>
-          </w:tcPr>
-          <w:p>
-            <w:pPr>
-              <w:spacing w:after="0"/>
-              <w:jc w:val="center"/>
-              <w:rPr>
-                <w:sz w:val="21"/>
-                <w:szCs w:val="21"/>
-              </w:rPr>
-            </w:pPr>
-            <w:r>
-              <w:rPr>
-                <w:rFonts w:ascii="Times New Roman" w:hAnsi="Times New Roman" w:eastAsia="Times New Roman" w:cs="Times New Roman"/>
-              </w:rPr>
-              <w:t>2. Visit overloaded nodes in ascending global ID; visit their currently assigned task indices in descending order.</w:t>
-            </w:r>
-          </w:p>
-        </w:tc>
-      </w:tr>
-      <w:tr>
-        <w:trPr>
-          <w:cantSplit/>
-          <w:jc w:val="center"/>
-        </w:trPr>
-        <w:tc>
-          <w:tcPr>
-            <w:tcW w:w="9100" w:type="dxa"/>
-            <w:tcBorders>
-              <w:top w:val="nil"/>
-              <w:left w:val="nil"/>
-              <w:bottom w:val="nil"/>
-              <w:right w:val="nil"/>
-            </w:tcBorders>
-            <w:tcMar>
-              <w:top w:w="60" w:type="dxa"/>
-              <w:left w:w="90" w:type="dxa"/>
-              <w:bottom w:w="60" w:type="dxa"/>
-              <w:right w:w="90" w:type="dxa"/>
-            </w:tcMar>
-            <w:vAlign w:val="center"/>
-            <w:gridSpan w:val="6"/>
-          </w:tcPr>
-          <w:p>
-            <w:pPr>
-              <w:spacing w:after="0"/>
-              <w:jc w:val="center"/>
-              <w:rPr>
-                <w:sz w:val="21"/>
-                <w:szCs w:val="21"/>
-              </w:rPr>
-            </w:pPr>
-            <w:r>
-              <w:rPr>
-                <w:rFonts w:ascii="Times New Roman" w:hAnsi="Times New Roman" w:eastAsia="Times New Roman" w:cs="Times New Roman"/>
-              </w:rPr>
-              <w:t>3. For a task, consider legal nodes other than its current node; retain only targets that remain within capacity after receiving that task at the target minimum rate.</w:t>
-            </w:r>
-          </w:p>
-        </w:tc>
-      </w:tr>
-      <w:tr>
-        <w:trPr>
-          <w:cantSplit/>
-          <w:jc w:val="center"/>
-        </w:trPr>
-        <w:tc>
-          <w:tcPr>
-            <w:tcW w:w="9100" w:type="dxa"/>
-            <w:tcBorders>
-              <w:top w:val="nil"/>
-              <w:left w:val="nil"/>
-              <w:bottom w:val="nil" w:sz="8" w:space="0" w:color="000000"/>
-              <w:right w:val="nil"/>
-            </w:tcBorders>
-            <w:tcMar>
-              <w:top w:w="60" w:type="dxa"/>
-              <w:left w:w="90" w:type="dxa"/>
-              <w:bottom w:w="60" w:type="dxa"/>
-              <w:right w:w="90" w:type="dxa"/>
-            </w:tcMar>
-            <w:vAlign w:val="center"/>
-            <w:gridSpan w:val="6"/>
-          </w:tcPr>
-          <w:p>
-            <w:pPr>
-              <w:spacing w:after="0"/>
-              <w:jc w:val="center"/>
-              <w:rPr>
-                <w:sz w:val="21"/>
-                <w:szCs w:val="21"/>
-              </w:rPr>
-            </w:pPr>
-            <w:r>
-              <w:rPr>
-                <w:rFonts w:ascii="Times New Roman" w:hAnsi="Times New Roman" w:eastAsia="Times New Roman" w:cs="Times New Roman"/>
-              </w:rPr>
-              <w:t>4. Move the task to the feasible target with largest post-move residual slack; break ties by smallest global node ID. Recompute use on the next pass.</w:t>
-            </w:r>
-          </w:p>
-        </w:tc>
-      </w:tr>
-      <w:tr>
-        <w:trPr>
-          <w:cantSplit/>
-          <w:jc w:val="center"/>
-        </w:trPr>
-        <w:tc>
-          <w:tcPr>
-            <w:tcW w:w="9100" w:type="dxa"/>
-            <w:tcBorders>
-              <w:top w:val="nil"/>
-              <w:left w:val="nil"/>
-              <w:bottom w:val="nil" w:sz="8" w:space="0" w:color="000000"/>
-              <w:right w:val="nil"/>
-            </w:tcBorders>
-            <w:tcMar>
-              <w:top w:w="60" w:type="dxa"/>
-              <w:left w:w="90" w:type="dxa"/>
-              <w:bottom w:w="60" w:type="dxa"/>
-              <w:right w:w="90" w:type="dxa"/>
-            </w:tcMar>
-            <w:vAlign w:val="center"/>
-            <w:gridSpan w:val="6"/>
-          </w:tcPr>
-          <w:p>
-            <w:pPr>
-              <w:spacing w:after="0"/>
-              <w:jc w:val="center"/>
-              <w:rPr>
-                <w:sz w:val="21"/>
-                <w:szCs w:val="21"/>
-              </w:rPr>
-            </w:pPr>
-            <w:r>
-              <w:rPr>
-                <w:rFonts w:ascii="Times New Roman" w:hAnsi="Times New Roman" w:eastAsia="Times New Roman" w:cs="Times New Roman"/>
-              </w:rPr>
-              <w:t>5. If no move resolves any remaining overload before the bound, raise ValueError(no feasible minimum-frequency assignment exists for this scenario); do not return a fitness.</w:t>
-            </w:r>
-          </w:p>
-        </w:tc>
-      </w:tr>
-      <w:tr>
-        <w:trPr>
-          <w:cantSplit/>
-          <w:jc w:val="center"/>
-        </w:trPr>
-        <w:tc>
-          <w:tcPr>
-            <w:tcW w:w="9100" w:type="dxa"/>
-            <w:tcBorders>
-              <w:top w:val="nil"/>
-              <w:left w:val="nil"/>
-              <w:bottom w:val="nil" w:sz="8" w:space="0" w:color="000000"/>
-              <w:right w:val="nil"/>
-            </w:tcBorders>
-            <w:tcMar>
-              <w:top w:w="60" w:type="dxa"/>
-              <w:left w:w="90" w:type="dxa"/>
-              <w:bottom w:w="60" w:type="dxa"/>
-              <w:right w:w="90" w:type="dxa"/>
-            </w:tcMar>
-            <w:vAlign w:val="center"/>
-            <w:gridSpan w:val="6"/>
-          </w:tcPr>
-          <w:p>
-            <w:pPr>
-              <w:spacing w:after="0"/>
-              <w:jc w:val="center"/>
-              <w:rPr>
-                <w:sz w:val="21"/>
-                <w:szCs w:val="21"/>
-              </w:rPr>
-            </w:pPr>
-            <w:r>
-              <w:rPr>
-                <w:rFonts w:ascii="Times New Roman" w:hAnsi="Times New Roman" w:eastAsia="Times New Roman" w:cs="Times New Roman"/>
-              </w:rPr>
-              <w:t>6. When minima fit, set every task to its node minimum. Retain requested excess if total excess fits residual capacity; otherwise proportionally scale only the excess.</w:t>
-            </w:r>
-          </w:p>
-        </w:tc>
-      </w:tr>
-      <w:tr>
-        <w:trPr>
-          <w:cantSplit/>
-          <w:jc w:val="center"/>
-        </w:trPr>
-        <w:tc>
-          <w:tcPr>
-            <w:tcW w:w="9100" w:type="dxa"/>
-            <w:tcBorders>
-              <w:top w:val="nil"/>
-              <w:left w:val="nil"/>
-              <w:bottom w:val="single" w:sz="8" w:space="0" w:color="000000"/>
-              <w:right w:val="nil"/>
-            </w:tcBorders>
-            <w:tcMar>
-              <w:top w:w="60" w:type="dxa"/>
-              <w:left w:w="90" w:type="dxa"/>
-              <w:bottom w:w="60" w:type="dxa"/>
-              <w:right w:w="90" w:type="dxa"/>
-            </w:tcMar>
-            <w:vAlign w:val="center"/>
-            <w:gridSpan w:val="6"/>
-          </w:tcPr>
-          <w:p>
-            <w:pPr>
-              <w:spacing w:after="0"/>
-              <w:jc w:val="center"/>
-              <w:rPr>
-                <w:sz w:val="21"/>
-                <w:szCs w:val="21"/>
-              </w:rPr>
-            </w:pPr>
-            <w:r>
-              <w:rPr>
-                <w:rFonts w:ascii="Times New Roman" w:hAnsi="Times New Roman" w:eastAsia="Times New Roman" w:cs="Times New Roman"/>
-              </w:rPr>
-              <w:t>Ensure: legal unique assignments, allocated rates within selected-node bounds and aggregate capacity; repair targets are pre-feasible, so no overload cycle is introduced.</w:t>
-            </w:r>
-          </w:p>
-        </w:tc>
-      </w:tr>
-    </w:tbl>
     <w:p>
       <w:pPr>
         <w:spacing w:after="0" w:line="252" w:lineRule="auto"/>
@@ -27012,7 +27012,7 @@
         <w:rPr>
           <w:rFonts w:ascii="Times New Roman" w:hAnsi="Times New Roman" w:eastAsia="Times New Roman" w:cs="Times New Roman"/>
         </w:rPr>
-        <w:t>Limitations include synthetic offline tasks, fixed-rate communication, deterministic cloud relay selection, device-side rather than infrastructure energy, a periodic no-backlog AoI approximation, coupled objective terms, engineering utility coefficients and the fixed set of implemented algorithms and 30 scenarios. Future work can investigate adaptive operator selection or DBO-dominant RDHO variants, queue-aware arrivals, communication-resource optimisation, infrastructure energy, calibrated QoE and physical testbeds without claiming that the present hybrid operator has already surpassed DBO.</w:t>
+        <w:t>Limitations include synthetic offline tasks, fixed-rate communication, deterministic cloud relay selection, device-side rather than infrastructure energy, a periodic no-backlog AoI approximation, coupled objective terms, engineering utility coefficients and the fixed set of implemented algorithms and 30 scenarios. Energy, delay and AoI also enter QoE, while delay enters AoI and all three reappear in CSR; the current study does not isolate the incremental contribution of each nested objective layer. Future work can investigate objective-layer ablation, adaptive operator selection or DBO-dominant RDHO variants, queue-aware arrivals, communication-resource optimisation, infrastructure energy, calibrated QoE and physical testbeds without claiming that the present hybrid operator has already surpassed DBO.</w:t>
       </w:r>
     </w:p>
     <w:p>

</xml_diff>

<commit_message>
docs: clarify controlled experiment conditions and repair limitation
</commit_message>
<xml_diff>
--- a/paper_artifacts/submission_readiness_manuscript_20260724/RDHO_capacity_feasible_controlled_evaluation_clean.docx
+++ b/paper_artifacts/submission_readiness_manuscript_20260724/RDHO_capacity_feasible_controlled_evaluation_clean.docx
@@ -78,7 +78,7 @@
         <w:rPr>
           <w:rFonts w:ascii="Times New Roman" w:hAnsi="Times New Roman" w:eastAsia="Times New Roman" w:cs="Times New Roman"/>
         </w:rPr>
-        <w:t>Mobile edge computing (MEC) complements resource-limited devices with nearby edge and remote cloud resources, but heterogeneous tasks couple discrete execution-node choice with allocated CPU-cycle-rate decisions. This paper develops an RDHO-based capacity-feasible framework: legal-node encoding and allocated CPU-cycle-rate decoding are coupled with deterministic capacity repair, RDHO population search, fixed-objective incumbent tracking and optional coordinate refinement. Under configured end-to-end procedures, RDHO-full achieves the lowest mean reporting fitness. Strict controls with common initialisation, decoder/repair path, exact NFE and common refinement show DBO clearly outperforms RDHO in Experiment A; at the prespecified reporting coefficient lambda_ref=1, DBO retains a smaller but statistically significant advantage in Experiment B. The smaller Experiment-B difference is sensitive to the fixed reporting-penalty coefficient. The evidence supports the integrated RDHO framework rather than universal superiority of its hybrid population update.</w:t>
+        <w:t>Mobile edge computing (MEC) complements resource-limited devices with nearby edge and remote cloud resources, but heterogeneous tasks couple discrete execution-node choice with allocated CPU-cycle-rate decisions. This paper develops an RDHO-based capacity-feasible framework: legal-node encoding and allocated CPU-cycle-rate decoding are coupled with deterministic capacity repair, RDHO population search, fixed-objective incumbent tracking and optional coordinate refinement. Under configured end-to-end procedures, RDHO-full achieves the lowest mean reporting fitness. Strict controls with common initialisation, a common decoder/repair path and exact NFE, together with common refinement in Experiment B, show that DBO clearly outperforms RDHO in Experiment A; at the prespecified reporting coefficient lambda_ref=1, DBO retains a smaller but statistically significant advantage in Experiment B. The smaller Experiment-B difference is sensitive to the fixed reporting-penalty coefficient. The evidence supports the integrated RDHO framework rather than universal superiority of its hybrid population update.</w:t>
       </w:r>
       <w:r/>
       <w:r/>
@@ -10288,7 +10288,7 @@
         <w:rPr>
           <w:rFonts w:ascii="Times New Roman" w:hAnsi="Times New Roman" w:eastAsia="Times New Roman" w:cs="Times New Roman"/>
         </w:rPr>
-        <w:t>At iteration t, p=t/T_max and diversity D is the mean over all 2N coordinates of their population standard deviation. Adaptive producer and scout shares are rho_P=clip(0.28-0.10p+0.08D,0.14,0.34) and rho_S=clip(0.08+0.08D+0.04p,0.08,0.20); rho_F=max(0.40,1-rho_P-rho_S). Nominal counts n_P, n_F and n_S are max(1,floor(P rho_role)) and are computed from the full P; they are not renormalised to P-n_E after n_E=max(1,floor(0.10P)) elites are reserved. The ranked loop applies deterministic branch precedence: an elite is copied; otherwise rank&lt;n_P gives producer, else rank&lt;n_P+n_F gives follower, else rank&gt;=P-n_S gives scout, else the member receives N(0,0.04(1-p)) noise. Thus elites truncate nominal roles, and if follower/scout thresholds overlap the earlier follower branch takes precedence; no member is assigned twice.</w:t>
+        <w:t>At iteration t, p=t/T_max and diversity D is the mean over all 2N coordinates of their population standard deviation. Adaptive producer and scout shares are rho_P=clip(0.28-0.10p+0.08D,0.14,0.34) and rho_S=clip(0.08+0.08D+0.04p,0.08,0.20); rho_F=max(0.40,1-rho_P-rho_S). Nominal counts n_P, n_F and n_S are max(1,floor(P rho_role)) and are computed from the full P; they are not renormalised to P-n_E after n_E=max(1,floor(0.10P)) elites are reserved. The ranked loop applies deterministic branch precedence: an elite is copied; otherwise rank&lt;n_P gives producer, else rank&lt;n_P+n_F gives follower, else rank&gt;=P-n_S gives scout, else the member receives N(0,0.04(1-p)) noise. Thus elites truncate nominal roles, and if follower/scout thresholds overlap the earlier follower branch takes precedence; no member is assigned twice. Consequently, rho_P, rho_F and rho_S define nominal role thresholds rather than guaranteed realised population proportions.</w:t>
       </w:r>
     </w:p>
     <w:p>
@@ -24251,57 +24251,7 @@
         <w:rPr>
           <w:rFonts w:ascii="Times New Roman" w:hAnsi="Times New Roman" w:eastAsia="Times New Roman" w:cs="Times New Roman"/>
         </w:rPr>
-        <w:t xml:space="preserve">The penalty heatmaps compare returned solutions under a common </w:t>
-      </w:r>
-      <m:oMath>
-        <m:sSub>
-          <m:e>
-            <m:r>
-              <w:rPr/>
-              <m:t>λ</m:t>
-            </m:r>
-          </m:e>
-          <m:sub>
-            <m:r>
-              <m:rPr>
-                <m:sty m:val="p"/>
-              </m:rPr>
-              <w:rPr/>
-              <m:t>r</m:t>
-            </m:r>
-            <m:r>
-              <m:rPr>
-                <m:sty m:val="p"/>
-              </m:rPr>
-              <w:rPr/>
-              <m:t>e</m:t>
-            </m:r>
-            <m:r>
-              <m:rPr>
-                <m:sty m:val="p"/>
-              </m:rPr>
-              <w:rPr/>
-              <m:t>f</m:t>
-            </m:r>
-          </m:sub>
-        </m:sSub>
-        <m:r>
-          <m:rPr>
-            <m:sty m:val="p"/>
-          </m:rPr>
-          <w:rPr/>
-          <m:t>=</m:t>
-        </m:r>
-        <m:r>
-          <w:rPr/>
-          <m:t>1</m:t>
-        </m:r>
-      </m:oMath>
-      <w:r>
-        <w:rPr>
-          <w:rFonts w:ascii="Times New Roman" w:hAnsi="Times New Roman" w:eastAsia="Times New Roman" w:cs="Times New Roman"/>
-        </w:rPr>
-        <w:t>; they do not alter the reporting definition.</w:t>
+        <w:t>The penalty heatmaps compare returned solutions under the common fixed reporting coefficient lambda_ref=1; they do not alter the reporting definition.</w:t>
       </w:r>
     </w:p>
     <w:p>
@@ -27012,7 +26962,7 @@
         <w:rPr>
           <w:rFonts w:ascii="Times New Roman" w:hAnsi="Times New Roman" w:eastAsia="Times New Roman" w:cs="Times New Roman"/>
         </w:rPr>
-        <w:t>Limitations include synthetic offline tasks, fixed-rate communication, deterministic cloud relay selection, device-side rather than infrastructure energy, a periodic no-backlog AoI approximation, coupled objective terms, engineering utility coefficients and the fixed set of implemented algorithms and 30 scenarios. Energy, delay and AoI also enter QoE, while delay enters AoI and all three reappear in CSR; the current study does not isolate the incremental contribution of each nested objective layer. Future work can investigate objective-layer ablation, adaptive operator selection or DBO-dominant RDHO variants, queue-aware arrivals, communication-resource optimisation, infrastructure energy, calibrated QoE and physical testbeds without claiming that the present hybrid operator has already surpassed DBO.</w:t>
+        <w:t>Limitations include synthetic offline tasks, fixed-rate communication, deterministic cloud relay selection, device-side rather than infrastructure energy, a periodic no-backlog AoI approximation, coupled objective terms, engineering utility coefficients and the fixed set of implemented algorithms and 30 scenarios. Energy, delay and AoI also enter QoE, while delay enters AoI and all three reappear in CSR; the current study does not isolate the incremental contribution of each nested objective layer. The current implementation aborts an optimiser run if deterministic candidate repair fails, although no such failure occurred in the reported controlled experiments. Future work can investigate objective-layer ablation, adaptive operator selection or DBO-dominant RDHO variants, queue-aware arrivals, communication-resource optimisation, infrastructure energy, calibrated QoE and physical testbeds without claiming that the present hybrid operator has already surpassed DBO.</w:t>
       </w:r>
     </w:p>
     <w:p>

</xml_diff>